<commit_message>
docs: adiciona README completo, guia de execucao e roteiro de testes. Atualiza compatibilidade Ubuntu confirmada via WSL2.
</commit_message>
<xml_diff>
--- a/docs/cinebridge.resumo.docx
+++ b/docs/cinebridge.resumo.docx
@@ -1472,25 +1472,20 @@
       <w:r>
         <w:t xml:space="preserve">Cód. </w:t>
       </w:r>
-      <w:proofErr w:type="gramStart"/>
       <w:r>
         <w:t>e</w:t>
       </w:r>
       <w:r>
-        <w:t>m</w:t>
-      </w:r>
-      <w:proofErr w:type="gramEnd"/>
-      <w:r>
-        <w:t xml:space="preserve"> módulos bem definidos</w:t>
-      </w:r>
-    </w:p>
-    <w:p>
-      <w:pPr>
-        <w:spacing w:line="240" w:lineRule="auto"/>
-        <w:jc w:val="both"/>
-      </w:pPr>
+        <w:t>m módulos bem definidos</w:t>
+      </w:r>
       <w:bookmarkStart w:id="0" w:name="_GoBack"/>
       <w:bookmarkEnd w:id="0"/>
+    </w:p>
+    <w:p>
+      <w:pPr>
+        <w:spacing w:line="240" w:lineRule="auto"/>
+        <w:jc w:val="both"/>
+      </w:pPr>
       <w:r>
         <w:t>Injeção de d</w:t>
       </w:r>

</xml_diff>